<commit_message>
WEEK 10: add explanatory paragraphs under every output figure
Each Output Snapshots cell now carries, in order: the terminal capture,
an italic bold figure caption, and a short paragraph describing what the
capture shows - matching the Week 8 record format.
</commit_message>
<xml_diff>
--- a/WEEK 10/Week10_Programs_22_25.docx
+++ b/WEEK 10/Week10_Programs_22_25.docx
@@ -8458,7 +8458,7 @@
           </w:p>
           <w:p>
             <w:pPr>
-              <w:spacing w:before="40" w:after="60"/>
+              <w:spacing w:before="40" w:after="40"/>
               <w:jc w:val="center"/>
             </w:pPr>
             <w:r>
@@ -8469,6 +8469,19 @@
                 <w:sz w:val="17"/>
               </w:rPr>
               <w:t>Fig. 1.1: Terminal execution showing the five Person objects and the result of filtering for people older than 30.</w:t>
+            </w:r>
+          </w:p>
+          <w:p>
+            <w:pPr>
+              <w:spacing w:before="20" w:after="60"/>
+              <w:jc w:val="both"/>
+            </w:pPr>
+            <w:r>
+              <w:rPr>
+                <w:rFonts w:ascii="Times New Roman" w:hAnsi="Times New Roman"/>
+                <w:sz w:val="17"/>
+              </w:rPr>
+              <w:t>The five Person objects are printed first, confirming that the case class apply method constructs instances without the new keyword. The filter function then keeps only Amit, Neha and Sara, so the console reports three people older than 30 out of five records.</w:t>
             </w:r>
           </w:p>
         </w:tc>
@@ -8544,7 +8557,7 @@
           </w:p>
           <w:p>
             <w:pPr>
-              <w:spacing w:before="40" w:after="60"/>
+              <w:spacing w:before="40" w:after="40"/>
               <w:jc w:val="center"/>
             </w:pPr>
             <w:r>
@@ -8555,6 +8568,19 @@
                 <w:sz w:val="17"/>
               </w:rPr>
               <w:t>Fig. 1.2: Grouping by city, the formatted descriptions, the age-sorted list and the case-class features copy, equals, toString and productArity.</w:t>
+            </w:r>
+          </w:p>
+          <w:p>
+            <w:pPr>
+              <w:spacing w:before="20" w:after="60"/>
+              <w:jc w:val="both"/>
+            </w:pPr>
+            <w:r>
+              <w:rPr>
+                <w:rFonts w:ascii="Times New Roman" w:hAnsi="Times New Roman"/>
+                <w:sz w:val="17"/>
+              </w:rPr>
+              <w:t>Grouping by city splits the list into Delhi, Mumbai and Pune, with the member names shown for each. The descriptions follow the exact sentence form required by the problem statement, the ages are listed in ascending order from 22 to 41, and the last block shows the copy, equals, toString and productArity members that every case class provides.</w:t>
             </w:r>
           </w:p>
         </w:tc>
@@ -11846,7 +11872,7 @@
           </w:p>
           <w:p>
             <w:pPr>
-              <w:spacing w:before="40" w:after="60"/>
+              <w:spacing w:before="40" w:after="40"/>
               <w:jc w:val="center"/>
             </w:pPr>
             <w:r>
@@ -11857,6 +11883,19 @@
                 <w:sz w:val="17"/>
               </w:rPr>
               <w:t>Fig. 2.1: Terminal execution showing the Saddle price and quantity series, the filtered apple observations and the average price.</w:t>
+            </w:r>
+          </w:p>
+          <w:p>
+            <w:pPr>
+              <w:spacing w:before="20" w:after="60"/>
+              <w:jc w:val="both"/>
+            </w:pPr>
+            <w:r>
+              <w:rPr>
+                <w:rFonts w:ascii="Times New Roman" w:hAnsi="Times New Roman"/>
+                <w:sz w:val="17"/>
+              </w:rPr>
+              <w:t>Two Saddle Series are built and printed with their day labels, which shows how Saddle keeps an index attached to the values. Selecting the apple rows returns all seven observations, and the reduction printed underneath gives the average price 126.86.</w:t>
             </w:r>
           </w:p>
         </w:tc>
@@ -11932,7 +11971,7 @@
           </w:p>
           <w:p>
             <w:pPr>
-              <w:spacing w:before="40" w:after="60"/>
+              <w:spacing w:before="40" w:after="40"/>
               <w:jc w:val="center"/>
             </w:pPr>
             <w:r>
@@ -11943,6 +11982,19 @@
                 <w:sz w:val="17"/>
               </w:rPr>
               <w:t>Fig. 2.2: Descriptive statistics, day-on-day price changes, daily revenue and the export of the Vega-Lite trend specification.</w:t>
+            </w:r>
+          </w:p>
+          <w:p>
+            <w:pPr>
+              <w:spacing w:before="20" w:after="60"/>
+              <w:jc w:val="both"/>
+            </w:pPr>
+            <w:r>
+              <w:rPr>
+                <w:rFonts w:ascii="Times New Roman" w:hAnsi="Times New Roman"/>
+                <w:sz w:val="17"/>
+              </w:rPr>
+              <w:t>The count, minimum, maximum and sum summarise the filtered series, and the day-on-day block marks every price movement as UP or DOWN. Multiplying the price and quantity series gives the daily revenue, and the last line confirms that the Vega-Lite trend specification was written to disk.</w:t>
             </w:r>
           </w:p>
         </w:tc>
@@ -15130,7 +15182,7 @@
           </w:p>
           <w:p>
             <w:pPr>
-              <w:spacing w:before="40" w:after="60"/>
+              <w:spacing w:before="40" w:after="40"/>
               <w:jc w:val="center"/>
             </w:pPr>
             <w:r>
@@ -15141,6 +15193,19 @@
                 <w:sz w:val="17"/>
               </w:rPr>
               <w:t>Fig. 3.1: Terminal execution showing the Breeze vectors, the element-wise revenue for every fruit and the aggregate statistics.</w:t>
+            </w:r>
+          </w:p>
+          <w:p>
+            <w:pPr>
+              <w:spacing w:before="20" w:after="60"/>
+              <w:jc w:val="both"/>
+            </w:pPr>
+            <w:r>
+              <w:rPr>
+                <w:rFonts w:ascii="Times New Roman" w:hAnsi="Times New Roman"/>
+                <w:sz w:val="17"/>
+              </w:rPr>
+              <w:t>The two Breeze DenseVectors are shown exactly as the library prints them. The element-wise product row by row gives the revenue of each fruit, followed by the reductions: total 21150, mean 4230, maximum 6000 for Apple and minimum 3600 shared by Banana and Mango.</w:t>
             </w:r>
           </w:p>
         </w:tc>
@@ -15216,7 +15281,7 @@
           </w:p>
           <w:p>
             <w:pPr>
-              <w:spacing w:before="40" w:after="60"/>
+              <w:spacing w:before="40" w:after="40"/>
               <w:jc w:val="center"/>
             </w:pPr>
             <w:r>
@@ -15227,6 +15292,19 @@
                 <w:sz w:val="17"/>
               </w:rPr>
               <w:t>Fig. 3.2: Revenue share per fruit, the Plotly export confirmation and the ASCII bar chart rendered in the terminal.</w:t>
+            </w:r>
+          </w:p>
+          <w:p>
+            <w:pPr>
+              <w:spacing w:before="20" w:after="60"/>
+              <w:jc w:val="both"/>
+            </w:pPr>
+            <w:r>
+              <w:rPr>
+                <w:rFonts w:ascii="Times New Roman" w:hAnsi="Times New Roman"/>
+                <w:sz w:val="17"/>
+              </w:rPr>
+              <w:t>The revenue share expresses each fruit as a percentage of the total, with Apple leading at 28.37 percent. The Plotly export line confirms the HTML chart was written, and the ASCII bars reproduce the same comparison in the terminal so the chart is visible in this record without opening a browser.</w:t>
             </w:r>
           </w:p>
         </w:tc>
@@ -18596,7 +18674,7 @@
           </w:p>
           <w:p>
             <w:pPr>
-              <w:spacing w:before="40" w:after="60"/>
+              <w:spacing w:before="40" w:after="40"/>
               <w:jc w:val="center"/>
             </w:pPr>
             <w:r>
@@ -18607,6 +18685,19 @@
                 <w:sz w:val="17"/>
               </w:rPr>
               <w:t>Fig. 4.1: Terminal execution showing the Saddle price series, the apple and banana subsets and the exact Spire statistics.</w:t>
+            </w:r>
+          </w:p>
+          <w:p>
+            <w:pPr>
+              <w:spacing w:before="20" w:after="60"/>
+              <w:jc w:val="both"/>
+            </w:pPr>
+            <w:r>
+              <w:rPr>
+                <w:rFonts w:ascii="Times New Roman" w:hAnsi="Times New Roman"/>
+                <w:sz w:val="17"/>
+              </w:rPr>
+              <w:t>The ten price readings are printed as one indexed Saddle Series. Row selection then splits them into the five apples and the five bananas, which are echoed back as plain vectors before any arithmetic is applied.</w:t>
             </w:r>
           </w:p>
         </w:tc>
@@ -18682,7 +18773,7 @@
           </w:p>
           <w:p>
             <w:pPr>
-              <w:spacing w:before="40" w:after="60"/>
+              <w:spacing w:before="40" w:after="40"/>
               <w:jc w:val="center"/>
             </w:pPr>
             <w:r>
@@ -18693,6 +18784,19 @@
                 <w:sz w:val="17"/>
               </w:rPr>
               <w:t>Fig. 4.2: Comparison of the exact and floating-point means, the comparison table and the export of the Vega-Lite trend specification.</w:t>
+            </w:r>
+          </w:p>
+          <w:p>
+            <w:pPr>
+              <w:spacing w:before="20" w:after="60"/>
+              <w:jc w:val="both"/>
+            </w:pPr>
+            <w:r>
+              <w:rPr>
+                <w:rFonts w:ascii="Times New Roman" w:hAnsi="Times New Roman"/>
+                <w:sz w:val="17"/>
+              </w:rPr>
+              <w:t>Spire Rational returns the mean and variance as exact fractions rather than decimals, and each fraction is printed beside its decimal equivalent. The cross-check section compares those exact means with Saddle's floating-point mean and reports a difference of exactly zero for both fruits, after which the comparison table and the trend export complete the run.</w:t>
             </w:r>
           </w:p>
         </w:tc>

</xml_diff>

<commit_message>
WEEK 10: collapse the cover onto a single page
The cover template carries enough empty paragraphs that October 2026 spilled
onto a second page. compact_cover.py zeroes the spacing from the first cover
heading onwards; it now matches Week 9, and the record is 16 pages with the
index starting on page 2.

Also ships compact_cover.py under both weeks' tools directories.
</commit_message>
<xml_diff>
--- a/WEEK 10/Week10_Programs_22_25.docx
+++ b/WEEK 10/Week10_Programs_22_25.docx
@@ -15,6 +15,7 @@
     </w:p>
     <w:p>
       <w:pPr>
+        <w:spacing w:before="0" w:after="0" w:line="240" w:lineRule="auto"/>
         <w:jc w:val="center"/>
         <w:rPr>
           <w:b/>
@@ -35,6 +36,7 @@
     </w:p>
     <w:p>
       <w:pPr>
+        <w:spacing w:before="0" w:after="0" w:line="240" w:lineRule="auto"/>
         <w:jc w:val="center"/>
         <w:rPr>
           <w:b/>
@@ -57,6 +59,7 @@
     </w:p>
     <w:p>
       <w:pPr>
+        <w:spacing w:before="0" w:after="0" w:line="240" w:lineRule="auto"/>
         <w:jc w:val="center"/>
         <w:rPr>
           <w:b/>
@@ -79,6 +82,7 @@
     </w:p>
     <w:p>
       <w:pPr>
+        <w:spacing w:before="0" w:after="0" w:line="240" w:lineRule="auto"/>
         <w:jc w:val="center"/>
         <w:rPr>
           <w:b/>
@@ -111,6 +115,7 @@
     </w:p>
     <w:p>
       <w:pPr>
+        <w:spacing w:before="0" w:after="0" w:line="240" w:lineRule="auto"/>
         <w:jc w:val="center"/>
         <w:rPr>
           <w:b/>
@@ -156,6 +161,7 @@
     </w:p>
     <w:p>
       <w:pPr>
+        <w:spacing w:before="0" w:after="0" w:line="240" w:lineRule="auto"/>
         <w:jc w:val="center"/>
         <w:rPr>
           <w:b/>
@@ -168,6 +174,7 @@
     </w:p>
     <w:p>
       <w:pPr>
+        <w:spacing w:before="0" w:after="0" w:line="240" w:lineRule="auto"/>
         <w:jc w:val="center"/>
         <w:rPr>
           <w:b/>
@@ -180,6 +187,7 @@
     </w:p>
     <w:p>
       <w:pPr>
+        <w:spacing w:before="0" w:after="0" w:line="240" w:lineRule="auto"/>
         <w:jc w:val="center"/>
         <w:rPr>
           <w:b/>
@@ -194,6 +202,7 @@
     </w:p>
     <w:p>
       <w:pPr>
+        <w:spacing w:before="0" w:after="0" w:line="240" w:lineRule="auto"/>
         <w:jc w:val="center"/>
         <w:rPr>
           <w:b/>
@@ -216,6 +225,7 @@
     </w:p>
     <w:p>
       <w:pPr>
+        <w:spacing w:before="0" w:after="0" w:line="240" w:lineRule="auto"/>
         <w:jc w:val="center"/>
         <w:rPr>
           <w:b/>
@@ -228,6 +238,7 @@
     </w:p>
     <w:p>
       <w:pPr>
+        <w:spacing w:before="0" w:after="0" w:line="240" w:lineRule="auto"/>
         <w:ind w:left="-567"/>
         <w:rPr>
           <w:noProof/>
@@ -239,6 +250,7 @@
         <w:rPr>
           <w:noProof/>
           <w:color w:val="C45911" w:themeColor="accent2" w:themeShade="BF"/>
+          <w:sz w:val="4"/>
           <w:lang w:eastAsia="en-IN"/>
         </w:rPr>
         <w:drawing>
@@ -258,6 +270,7 @@
     </w:p>
     <w:p>
       <w:pPr>
+        <w:spacing w:before="0" w:after="0" w:line="240" w:lineRule="auto"/>
         <w:jc w:val="center"/>
         <w:rPr>
           <w:noProof/>
@@ -269,6 +282,7 @@
         <w:rPr>
           <w:noProof/>
           <w:color w:val="C45911" w:themeColor="accent2" w:themeShade="BF"/>
+          <w:sz w:val="4"/>
           <w:lang w:eastAsia="en-IN"/>
         </w:rPr>
         <w:t xml:space="preserve">            </w:t>
@@ -276,6 +290,7 @@
     </w:p>
     <w:p>
       <w:pPr>
+        <w:spacing w:before="0" w:after="0" w:line="240" w:lineRule="auto"/>
         <w:jc w:val="center"/>
         <w:rPr>
           <w:b/>
@@ -290,7 +305,7 @@
           <w:b/>
           <w:noProof/>
           <w:color w:val="C45911" w:themeColor="accent2" w:themeShade="BF"/>
-          <w:sz w:val="32"/>
+          <w:sz w:val="4"/>
           <w:lang w:eastAsia="en-IN"/>
         </w:rPr>
         <w:t xml:space="preserve"> </w:t>
@@ -298,6 +313,7 @@
     </w:p>
     <w:p>
       <w:pPr>
+        <w:spacing w:before="0" w:after="0" w:line="240" w:lineRule="auto"/>
         <w:jc w:val="center"/>
         <w:rPr>
           <w:b/>
@@ -310,6 +326,7 @@
     </w:p>
     <w:p>
       <w:pPr>
+        <w:spacing w:before="0" w:after="0" w:line="240" w:lineRule="auto"/>
         <w:jc w:val="center"/>
         <w:rPr>
           <w:b/>
@@ -332,6 +349,7 @@
     </w:p>
     <w:p>
       <w:pPr>
+        <w:spacing w:before="0" w:after="0" w:line="240" w:lineRule="auto"/>
         <w:jc w:val="center"/>
         <w:rPr>
           <w:b/>
@@ -343,6 +361,7 @@
     </w:p>
     <w:p>
       <w:pPr>
+        <w:spacing w:before="0" w:after="0" w:line="240" w:lineRule="auto"/>
         <w:ind w:left="-567"/>
         <w:rPr>
           <w:noProof/>
@@ -354,6 +373,7 @@
         <w:rPr>
           <w:noProof/>
           <w:color w:val="C45911" w:themeColor="accent2" w:themeShade="BF"/>
+          <w:sz w:val="4"/>
           <w:lang w:eastAsia="en-IN"/>
         </w:rPr>
         <w:drawing>
@@ -373,6 +393,7 @@
     </w:p>
     <w:p>
       <w:pPr>
+        <w:spacing w:before="0" w:after="0" w:line="240" w:lineRule="auto"/>
         <w:ind w:firstLine="720"/>
         <w:rPr>
           <w:noProof/>
@@ -383,6 +404,7 @@
     </w:p>
     <w:p>
       <w:pPr>
+        <w:spacing w:before="0" w:after="0" w:line="240" w:lineRule="auto"/>
         <w:jc w:val="center"/>
         <w:rPr>
           <w:b/>
@@ -396,6 +418,7 @@
     </w:p>
     <w:p>
       <w:pPr>
+        <w:spacing w:before="0" w:after="0" w:line="240" w:lineRule="auto"/>
         <w:jc w:val="center"/>
         <w:rPr>
           <w:b/>
@@ -409,6 +432,7 @@
     </w:p>
     <w:p>
       <w:pPr>
+        <w:spacing w:before="0" w:after="0" w:line="240" w:lineRule="auto"/>
         <w:jc w:val="center"/>
         <w:rPr>
           <w:b/>
@@ -422,6 +446,7 @@
     </w:p>
     <w:p>
       <w:pPr>
+        <w:spacing w:before="0" w:after="0" w:line="240" w:lineRule="auto"/>
         <w:jc w:val="center"/>
         <w:rPr>
           <w:b/>
@@ -435,6 +460,7 @@
     </w:p>
     <w:p>
       <w:pPr>
+        <w:spacing w:before="0" w:after="0" w:line="240" w:lineRule="auto"/>
         <w:jc w:val="center"/>
       </w:pPr>
       <w:r>
@@ -448,6 +474,7 @@
     </w:p>
     <w:p>
       <w:pPr>
+        <w:spacing w:before="0" w:after="0" w:line="240" w:lineRule="auto"/>
         <w:jc w:val="center"/>
         <w:rPr>
           <w:noProof/>
@@ -561,6 +588,7 @@
     </w:p>
     <w:p>
       <w:pPr>
+        <w:spacing w:before="0" w:after="0" w:line="240" w:lineRule="auto"/>
         <w:jc w:val="center"/>
         <w:rPr>
           <w:b/>

</xml_diff>

<commit_message>
WEEK 9/10: centre and bold the date line in the running header
The Date / Week No. / Program S. No. line was left-aligned at 10pt regular.
It now uses explicit centre (4513 twips) and right (9026 twips) tab stops at
12pt bold, matching the Week 8 record. Measured positions align with A8 to
within 2pt.
</commit_message>
<xml_diff>
--- a/WEEK 10/Week10_Programs_22_25.docx
+++ b/WEEK 10/Week10_Programs_22_25.docx
@@ -19393,21 +19393,23 @@
     <w:pPr>
       <w:spacing w:before="0" w:after="0"/>
       <w:tabs>
-        <w:tab w:val="center" w:pos="3400"/>
-        <w:tab w:val="right" w:pos="6800"/>
+        <w:tab w:val="center" w:pos="4513"/>
+        <w:tab w:val="right" w:pos="9026"/>
       </w:tabs>
     </w:pPr>
     <w:r>
       <w:rPr>
         <w:rFonts w:ascii="Times New Roman" w:hAnsi="Times New Roman"/>
-        <w:sz w:val="20"/>
+        <w:b/>
+        <w:sz w:val="24"/>
       </w:rPr>
       <w:t>Date: 15/10/2026</w:t>
     </w:r>
     <w:r>
       <w:rPr>
         <w:rFonts w:ascii="Times New Roman" w:hAnsi="Times New Roman"/>
-        <w:sz w:val="20"/>
+        <w:b/>
+        <w:sz w:val="24"/>
       </w:rPr>
       <w:tab/>
       <w:t>Week No.: 13</w:t>
@@ -19415,7 +19417,8 @@
     <w:r>
       <w:rPr>
         <w:rFonts w:ascii="Times New Roman" w:hAnsi="Times New Roman"/>
-        <w:sz w:val="20"/>
+        <w:b/>
+        <w:sz w:val="24"/>
       </w:rPr>
       <w:tab/>
       <w:t>Program S. No. 22</w:t>
@@ -19474,21 +19477,23 @@
     <w:pPr>
       <w:spacing w:before="0" w:after="0"/>
       <w:tabs>
-        <w:tab w:val="center" w:pos="3400"/>
-        <w:tab w:val="right" w:pos="6800"/>
+        <w:tab w:val="center" w:pos="4513"/>
+        <w:tab w:val="right" w:pos="9026"/>
       </w:tabs>
     </w:pPr>
     <w:r>
       <w:rPr>
         <w:rFonts w:ascii="Times New Roman" w:hAnsi="Times New Roman"/>
-        <w:sz w:val="20"/>
+        <w:b/>
+        <w:sz w:val="24"/>
       </w:rPr>
       <w:t>Date: 15/10/2026</w:t>
     </w:r>
     <w:r>
       <w:rPr>
         <w:rFonts w:ascii="Times New Roman" w:hAnsi="Times New Roman"/>
-        <w:sz w:val="20"/>
+        <w:b/>
+        <w:sz w:val="24"/>
       </w:rPr>
       <w:tab/>
       <w:t>Week No.: 13</w:t>
@@ -19496,7 +19501,8 @@
     <w:r>
       <w:rPr>
         <w:rFonts w:ascii="Times New Roman" w:hAnsi="Times New Roman"/>
-        <w:sz w:val="20"/>
+        <w:b/>
+        <w:sz w:val="24"/>
       </w:rPr>
       <w:tab/>
       <w:t>Program S. No. 23</w:t>
@@ -19555,21 +19561,23 @@
     <w:pPr>
       <w:spacing w:before="0" w:after="0"/>
       <w:tabs>
-        <w:tab w:val="center" w:pos="3400"/>
-        <w:tab w:val="right" w:pos="6800"/>
+        <w:tab w:val="center" w:pos="4513"/>
+        <w:tab w:val="right" w:pos="9026"/>
       </w:tabs>
     </w:pPr>
     <w:r>
       <w:rPr>
         <w:rFonts w:ascii="Times New Roman" w:hAnsi="Times New Roman"/>
-        <w:sz w:val="20"/>
+        <w:b/>
+        <w:sz w:val="24"/>
       </w:rPr>
       <w:t>Date: 22/10/2026</w:t>
     </w:r>
     <w:r>
       <w:rPr>
         <w:rFonts w:ascii="Times New Roman" w:hAnsi="Times New Roman"/>
-        <w:sz w:val="20"/>
+        <w:b/>
+        <w:sz w:val="24"/>
       </w:rPr>
       <w:tab/>
       <w:t>Week No.: 14</w:t>
@@ -19577,7 +19585,8 @@
     <w:r>
       <w:rPr>
         <w:rFonts w:ascii="Times New Roman" w:hAnsi="Times New Roman"/>
-        <w:sz w:val="20"/>
+        <w:b/>
+        <w:sz w:val="24"/>
       </w:rPr>
       <w:tab/>
       <w:t>Program S. No. 24</w:t>
@@ -19636,21 +19645,23 @@
     <w:pPr>
       <w:spacing w:before="0" w:after="0"/>
       <w:tabs>
-        <w:tab w:val="center" w:pos="3400"/>
-        <w:tab w:val="right" w:pos="6800"/>
+        <w:tab w:val="center" w:pos="4513"/>
+        <w:tab w:val="right" w:pos="9026"/>
       </w:tabs>
     </w:pPr>
     <w:r>
       <w:rPr>
         <w:rFonts w:ascii="Times New Roman" w:hAnsi="Times New Roman"/>
-        <w:sz w:val="20"/>
+        <w:b/>
+        <w:sz w:val="24"/>
       </w:rPr>
       <w:t>Date: 22/10/2026</w:t>
     </w:r>
     <w:r>
       <w:rPr>
         <w:rFonts w:ascii="Times New Roman" w:hAnsi="Times New Roman"/>
-        <w:sz w:val="20"/>
+        <w:b/>
+        <w:sz w:val="24"/>
       </w:rPr>
       <w:tab/>
       <w:t>Week No.: 14</w:t>
@@ -19658,7 +19669,8 @@
     <w:r>
       <w:rPr>
         <w:rFonts w:ascii="Times New Roman" w:hAnsi="Times New Roman"/>
-        <w:sz w:val="20"/>
+        <w:b/>
+        <w:sz w:val="24"/>
       </w:rPr>
       <w:tab/>
       <w:t>Program S. No. 25</w:t>

</xml_diff>

<commit_message>
WEEK 9/10: fill in the missing Title column entries in the index
Rows 2, 4, 6 and 8 (and row 10, which held library names) had blank or wrong
titles in the index, unlike Week 8. They now read:

  2  AI Model Performance Analysis Using Pandas
  4  Movie Rating Data Preprocessing Using Pandas
  6  Warehouse Shipment and Logistic Analytics Using NumPy
  8  Employee Attrition Prediction Using Workforce Indicators
  9  Web Scraping and Data Collection
 10  Online Job Market Analytics

Titles are taken from the program records, so the index and the body agree.
</commit_message>
<xml_diff>
--- a/WEEK 10/Week10_Programs_22_25.docx
+++ b/WEEK 10/Week10_Programs_22_25.docx
@@ -1195,6 +1195,7 @@
                 <w:b w:val="0"/>
                 <w:sz w:val="15"/>
               </w:rPr>
+              <w:t>AI Model Performance Analysis Using Pandas</w:t>
             </w:r>
           </w:p>
         </w:tc>
@@ -1651,6 +1652,7 @@
                 <w:b w:val="0"/>
                 <w:sz w:val="15"/>
               </w:rPr>
+              <w:t>Movie Rating Data Preprocessing Using Pandas</w:t>
             </w:r>
           </w:p>
         </w:tc>
@@ -2107,6 +2109,7 @@
                 <w:b w:val="0"/>
                 <w:sz w:val="15"/>
               </w:rPr>
+              <w:t>Warehouse Shipment and Logistic Analytics Using NumPy</w:t>
             </w:r>
           </w:p>
         </w:tc>
@@ -2498,6 +2501,7 @@
                 <w:b w:val="0"/>
                 <w:sz w:val="15"/>
               </w:rPr>
+              <w:t>Employee Attrition Prediction Using Workforce Indicators</w:t>
             </w:r>
           </w:p>
         </w:tc>
@@ -2747,7 +2751,7 @@
                 <w:b w:val="0"/>
                 <w:sz w:val="15"/>
               </w:rPr>
-              <w:t>requests, BeautifulSouppandasjson</w:t>
+              <w:t>Web Scraping and Data Collection</w:t>
             </w:r>
           </w:p>
         </w:tc>
@@ -2915,33 +2919,7 @@
                 <w:b w:val="0"/>
                 <w:sz w:val="15"/>
               </w:rPr>
-              <w:t>requests, BeautifulSoup</w:t>
-            </w:r>
-          </w:p>
-          <w:p>
-            <w:pPr>
-              <w:spacing w:before="0" w:after="0" w:line="240" w:lineRule="auto"/>
-            </w:pPr>
-            <w:r>
-              <w:rPr>
-                <w:rFonts w:ascii="Times New Roman" w:hAnsi="Times New Roman"/>
-                <w:b w:val="0"/>
-                <w:sz w:val="15"/>
-              </w:rPr>
-              <w:t>pandas</w:t>
-            </w:r>
-          </w:p>
-          <w:p>
-            <w:pPr>
-              <w:spacing w:before="0" w:after="0" w:line="240" w:lineRule="auto"/>
-            </w:pPr>
-            <w:r>
-              <w:rPr>
-                <w:rFonts w:ascii="Times New Roman" w:hAnsi="Times New Roman"/>
-                <w:b w:val="0"/>
-                <w:sz w:val="15"/>
-              </w:rPr>
-              <w:t>json</w:t>
+              <w:t>Online Job Market Analytics</w:t>
             </w:r>
           </w:p>
         </w:tc>

</xml_diff>